<commit_message>
Complete user manual with all 25 screenshots embedded
Co-Authored-By: Claude Opus 4.8 <noreply@anthropic.com>
</commit_message>
<xml_diff>
--- a/docs/White_and_Bright_ERP_User_Manual.docx
+++ b/docs/White_and_Bright_ERP_User_Manual.docx
@@ -324,25 +324,67 @@
     </w:p>
     <w:p>
       <w:pPr>
+        <w:spacing w:after="20" w:before="100"/>
+        <w:jc w:val="center"/>
+      </w:pPr>
+      <w:r>
+        <w:drawing>
+          <wp:inline distT="0" distB="0" distL="0" distR="0">
+            <wp:extent cx="5715000" cy="2857500"/>
+            <wp:effectExtent t="0" r="0" b="0" l="0"/>
+            <wp:docPr id="1" name="" descr="" title=""/>
+            <wp:cNvGraphicFramePr>
+              <a:graphicFrameLocks xmlns:a="http://schemas.openxmlformats.org/drawingml/2006/main" noChangeAspect="1"/>
+            </wp:cNvGraphicFramePr>
+            <a:graphic xmlns:a="http://schemas.openxmlformats.org/drawingml/2006/main">
+              <a:graphicData uri="http://schemas.openxmlformats.org/drawingml/2006/picture">
+                <pic:pic xmlns:pic="http://schemas.openxmlformats.org/drawingml/2006/picture">
+                  <pic:nvPicPr>
+                    <pic:cNvPr id="0" name="" descr=""/>
+                    <pic:cNvPicPr>
+                      <a:picLocks noChangeAspect="1" noChangeArrowheads="1"/>
+                    </pic:cNvPicPr>
+                  </pic:nvPicPr>
+                  <pic:blipFill>
+                    <a:blip r:embed="rId7" cstate="none"/>
+                    <a:srcRect/>
+                    <a:stretch>
+                      <a:fillRect/>
+                    </a:stretch>
+                  </pic:blipFill>
+                  <pic:spPr bwMode="auto">
+                    <a:xfrm>
+                      <a:off x="0" y="0"/>
+                      <a:ext cx="5715000" cy="2857500"/>
+                    </a:xfrm>
+                    <a:prstGeom prst="rect">
+                      <a:avLst/>
+                    </a:prstGeom>
+                  </pic:spPr>
+                </pic:pic>
+              </a:graphicData>
+            </a:graphic>
+          </wp:inline>
+        </w:drawing>
+      </w:r>
+    </w:p>
+    <w:p>
+      <w:pPr>
         <w:pBdr>
-          <w:top w:val="dashed" w:color="023E71" w:sz="6"/>
-          <w:bottom w:val="dashed" w:color="023E71" w:sz="6"/>
-          <w:left w:val="dashed" w:color="023E71" w:sz="6"/>
-          <w:right w:val="dashed" w:color="023E71" w:sz="6"/>
+          <w:bottom w:val="single" w:color="EEF3F9" w:sz="2"/>
         </w:pBdr>
-        <w:shd w:fill="EEF3F9" w:val="clear"/>
-        <w:spacing w:after="180" w:before="80"/>
+        <w:spacing w:after="200"/>
         <w:jc w:val="center"/>
       </w:pPr>
       <w:r>
         <w:rPr>
           <w:i/>
           <w:iCs/>
-          <w:color w:val="023E71"/>
-          <w:sz w:val="20"/>
-          <w:szCs w:val="20"/>
+          <w:color w:val="667788"/>
+          <w:sz w:val="16"/>
+          <w:szCs w:val="16"/>
         </w:rPr>
-        <w:t xml:space="preserve">[  Screenshot: Login screen  ]</w:t>
+        <w:t xml:space="preserve">Figure 1: The sign-in screen</w:t>
       </w:r>
     </w:p>
     <w:p>
@@ -382,90 +424,72 @@
         <w:spacing w:after="120"/>
       </w:pPr>
       <w:r>
-        <w:t xml:space="preserve">The screen has three main areas:</w:t>
-      </w:r>
-    </w:p>
-    <w:p>
-      <w:pPr>
-        <w:pStyle w:val="ListParagraph"/>
-        <w:numPr>
-          <w:ilvl w:val="0"/>
-          <w:numId w:val="2"/>
-        </w:numPr>
-        <w:spacing w:after="40"/>
-      </w:pPr>
-      <w:r>
-        <w:rPr>
-          <w:b/>
-          <w:bCs/>
-        </w:rPr>
-        <w:t xml:space="preserve">Left sidebar — </w:t>
-      </w:r>
-      <w:r>
-        <w:t xml:space="preserve">every module you are allowed to open, grouped by area (Finance, Human Resources, and so on). Click a group heading to expand or collapse it, and use the arrow at the top to shrink the sidebar to icons.</w:t>
-      </w:r>
-    </w:p>
-    <w:p>
-      <w:pPr>
-        <w:pStyle w:val="ListParagraph"/>
-        <w:numPr>
-          <w:ilvl w:val="0"/>
-          <w:numId w:val="2"/>
-        </w:numPr>
-        <w:spacing w:after="40"/>
-      </w:pPr>
-      <w:r>
-        <w:rPr>
-          <w:b/>
-          <w:bCs/>
-        </w:rPr>
-        <w:t xml:space="preserve">Top bar — </w:t>
-      </w:r>
-      <w:r>
-        <w:t xml:space="preserve">the company switcher (left), a search box, the “?” help button, the notifications bell, and your account menu (right).</w:t>
-      </w:r>
-    </w:p>
-    <w:p>
-      <w:pPr>
-        <w:pStyle w:val="ListParagraph"/>
-        <w:numPr>
-          <w:ilvl w:val="0"/>
-          <w:numId w:val="2"/>
-        </w:numPr>
-        <w:spacing w:after="40"/>
-      </w:pPr>
-      <w:r>
-        <w:rPr>
-          <w:b/>
-          <w:bCs/>
-        </w:rPr>
-        <w:t xml:space="preserve">Main area — </w:t>
-      </w:r>
-      <w:r>
-        <w:t xml:space="preserve">the screen you are working on.</w:t>
+        <w:t xml:space="preserve">The screen has three main areas: the left sidebar (modules you can open, grouped by area), the top bar (company switcher, search, the “?” help button, the notifications bell and your account menu), and the main working area.</w:t>
+      </w:r>
+    </w:p>
+    <w:p>
+      <w:pPr>
+        <w:spacing w:after="20" w:before="100"/>
+        <w:jc w:val="center"/>
+      </w:pPr>
+      <w:r>
+        <w:drawing>
+          <wp:inline distT="0" distB="0" distL="0" distR="0">
+            <wp:extent cx="5715000" cy="3076575"/>
+            <wp:effectExtent t="0" r="0" b="0" l="0"/>
+            <wp:docPr id="1" name="" descr="" title=""/>
+            <wp:cNvGraphicFramePr>
+              <a:graphicFrameLocks xmlns:a="http://schemas.openxmlformats.org/drawingml/2006/main" noChangeAspect="1"/>
+            </wp:cNvGraphicFramePr>
+            <a:graphic xmlns:a="http://schemas.openxmlformats.org/drawingml/2006/main">
+              <a:graphicData uri="http://schemas.openxmlformats.org/drawingml/2006/picture">
+                <pic:pic xmlns:pic="http://schemas.openxmlformats.org/drawingml/2006/picture">
+                  <pic:nvPicPr>
+                    <pic:cNvPr id="0" name="" descr=""/>
+                    <pic:cNvPicPr>
+                      <a:picLocks noChangeAspect="1" noChangeArrowheads="1"/>
+                    </pic:cNvPicPr>
+                  </pic:nvPicPr>
+                  <pic:blipFill>
+                    <a:blip r:embed="rId8" cstate="none"/>
+                    <a:srcRect/>
+                    <a:stretch>
+                      <a:fillRect/>
+                    </a:stretch>
+                  </pic:blipFill>
+                  <pic:spPr bwMode="auto">
+                    <a:xfrm>
+                      <a:off x="0" y="0"/>
+                      <a:ext cx="5715000" cy="3076575"/>
+                    </a:xfrm>
+                    <a:prstGeom prst="rect">
+                      <a:avLst/>
+                    </a:prstGeom>
+                  </pic:spPr>
+                </pic:pic>
+              </a:graphicData>
+            </a:graphic>
+          </wp:inline>
+        </w:drawing>
       </w:r>
     </w:p>
     <w:p>
       <w:pPr>
         <w:pBdr>
-          <w:top w:val="dashed" w:color="023E71" w:sz="6"/>
-          <w:bottom w:val="dashed" w:color="023E71" w:sz="6"/>
-          <w:left w:val="dashed" w:color="023E71" w:sz="6"/>
-          <w:right w:val="dashed" w:color="023E71" w:sz="6"/>
+          <w:bottom w:val="single" w:color="EEF3F9" w:sz="2"/>
         </w:pBdr>
-        <w:shd w:fill="EEF3F9" w:val="clear"/>
-        <w:spacing w:after="180" w:before="80"/>
+        <w:spacing w:after="200"/>
         <w:jc w:val="center"/>
       </w:pPr>
       <w:r>
         <w:rPr>
           <w:i/>
           <w:iCs/>
-          <w:color w:val="023E71"/>
-          <w:sz w:val="20"/>
-          <w:szCs w:val="20"/>
+          <w:color w:val="667788"/>
+          <w:sz w:val="16"/>
+          <w:szCs w:val="16"/>
         </w:rPr>
-        <w:t xml:space="preserve">[  Screenshot: Dashboard with the sidebar and top bar labelled  ]</w:t>
+        <w:t xml:space="preserve">Figure 2: The Dashboard — sidebar (left), top bar (top) and main area</w:t>
       </w:r>
     </w:p>
     <w:p>
@@ -606,25 +630,67 @@
     </w:p>
     <w:p>
       <w:pPr>
+        <w:spacing w:after="20" w:before="100"/>
+        <w:jc w:val="center"/>
+      </w:pPr>
+      <w:r>
+        <w:drawing>
+          <wp:inline distT="0" distB="0" distL="0" distR="0">
+            <wp:extent cx="5715000" cy="3076575"/>
+            <wp:effectExtent t="0" r="0" b="0" l="0"/>
+            <wp:docPr id="1" name="" descr="" title=""/>
+            <wp:cNvGraphicFramePr>
+              <a:graphicFrameLocks xmlns:a="http://schemas.openxmlformats.org/drawingml/2006/main" noChangeAspect="1"/>
+            </wp:cNvGraphicFramePr>
+            <a:graphic xmlns:a="http://schemas.openxmlformats.org/drawingml/2006/main">
+              <a:graphicData uri="http://schemas.openxmlformats.org/drawingml/2006/picture">
+                <pic:pic xmlns:pic="http://schemas.openxmlformats.org/drawingml/2006/picture">
+                  <pic:nvPicPr>
+                    <pic:cNvPr id="0" name="" descr=""/>
+                    <pic:cNvPicPr>
+                      <a:picLocks noChangeAspect="1" noChangeArrowheads="1"/>
+                    </pic:cNvPicPr>
+                  </pic:nvPicPr>
+                  <pic:blipFill>
+                    <a:blip r:embed="rId8" cstate="none"/>
+                    <a:srcRect/>
+                    <a:stretch>
+                      <a:fillRect/>
+                    </a:stretch>
+                  </pic:blipFill>
+                  <pic:spPr bwMode="auto">
+                    <a:xfrm>
+                      <a:off x="0" y="0"/>
+                      <a:ext cx="5715000" cy="3076575"/>
+                    </a:xfrm>
+                    <a:prstGeom prst="rect">
+                      <a:avLst/>
+                    </a:prstGeom>
+                  </pic:spPr>
+                </pic:pic>
+              </a:graphicData>
+            </a:graphic>
+          </wp:inline>
+        </w:drawing>
+      </w:r>
+    </w:p>
+    <w:p>
+      <w:pPr>
         <w:pBdr>
-          <w:top w:val="dashed" w:color="023E71" w:sz="6"/>
-          <w:bottom w:val="dashed" w:color="023E71" w:sz="6"/>
-          <w:left w:val="dashed" w:color="023E71" w:sz="6"/>
-          <w:right w:val="dashed" w:color="023E71" w:sz="6"/>
+          <w:bottom w:val="single" w:color="EEF3F9" w:sz="2"/>
         </w:pBdr>
-        <w:shd w:fill="EEF3F9" w:val="clear"/>
-        <w:spacing w:after="180" w:before="80"/>
+        <w:spacing w:after="200"/>
         <w:jc w:val="center"/>
       </w:pPr>
       <w:r>
         <w:rPr>
           <w:i/>
           <w:iCs/>
-          <w:color w:val="023E71"/>
-          <w:sz w:val="20"/>
-          <w:szCs w:val="20"/>
+          <w:color w:val="667788"/>
+          <w:sz w:val="16"/>
+          <w:szCs w:val="16"/>
         </w:rPr>
-        <w:t xml:space="preserve">[  Screenshot: Dashboard KPI cards  ]</w:t>
+        <w:t xml:space="preserve">Figure 3: Dashboard KPI cards and group companies</w:t>
       </w:r>
     </w:p>
     <w:p>
@@ -789,30 +855,72 @@
         <w:spacing w:after="40"/>
       </w:pPr>
       <w:r>
-        <w:t xml:space="preserve">Click Save. The reference number is generated automatically.</w:t>
+        <w:t xml:space="preserve">Click Post entry. The reference number is generated automatically.</w:t>
+      </w:r>
+    </w:p>
+    <w:p>
+      <w:pPr>
+        <w:spacing w:after="20" w:before="100"/>
+        <w:jc w:val="center"/>
+      </w:pPr>
+      <w:r>
+        <w:drawing>
+          <wp:inline distT="0" distB="0" distL="0" distR="0">
+            <wp:extent cx="5715000" cy="3076575"/>
+            <wp:effectExtent t="0" r="0" b="0" l="0"/>
+            <wp:docPr id="1" name="" descr="" title=""/>
+            <wp:cNvGraphicFramePr>
+              <a:graphicFrameLocks xmlns:a="http://schemas.openxmlformats.org/drawingml/2006/main" noChangeAspect="1"/>
+            </wp:cNvGraphicFramePr>
+            <a:graphic xmlns:a="http://schemas.openxmlformats.org/drawingml/2006/main">
+              <a:graphicData uri="http://schemas.openxmlformats.org/drawingml/2006/picture">
+                <pic:pic xmlns:pic="http://schemas.openxmlformats.org/drawingml/2006/picture">
+                  <pic:nvPicPr>
+                    <pic:cNvPr id="0" name="" descr=""/>
+                    <pic:cNvPicPr>
+                      <a:picLocks noChangeAspect="1" noChangeArrowheads="1"/>
+                    </pic:cNvPicPr>
+                  </pic:nvPicPr>
+                  <pic:blipFill>
+                    <a:blip r:embed="rId9" cstate="none"/>
+                    <a:srcRect/>
+                    <a:stretch>
+                      <a:fillRect/>
+                    </a:stretch>
+                  </pic:blipFill>
+                  <pic:spPr bwMode="auto">
+                    <a:xfrm>
+                      <a:off x="0" y="0"/>
+                      <a:ext cx="5715000" cy="3076575"/>
+                    </a:xfrm>
+                    <a:prstGeom prst="rect">
+                      <a:avLst/>
+                    </a:prstGeom>
+                  </pic:spPr>
+                </pic:pic>
+              </a:graphicData>
+            </a:graphic>
+          </wp:inline>
+        </w:drawing>
       </w:r>
     </w:p>
     <w:p>
       <w:pPr>
         <w:pBdr>
-          <w:top w:val="dashed" w:color="023E71" w:sz="6"/>
-          <w:bottom w:val="dashed" w:color="023E71" w:sz="6"/>
-          <w:left w:val="dashed" w:color="023E71" w:sz="6"/>
-          <w:right w:val="dashed" w:color="023E71" w:sz="6"/>
+          <w:bottom w:val="single" w:color="EEF3F9" w:sz="2"/>
         </w:pBdr>
-        <w:shd w:fill="EEF3F9" w:val="clear"/>
-        <w:spacing w:after="180" w:before="80"/>
+        <w:spacing w:after="200"/>
         <w:jc w:val="center"/>
       </w:pPr>
       <w:r>
         <w:rPr>
           <w:i/>
           <w:iCs/>
-          <w:color w:val="023E71"/>
-          <w:sz w:val="20"/>
-          <w:szCs w:val="20"/>
+          <w:color w:val="667788"/>
+          <w:sz w:val="16"/>
+          <w:szCs w:val="16"/>
         </w:rPr>
-        <w:t xml:space="preserve">[  Screenshot: New journal entry form  ]</w:t>
+        <w:t xml:space="preserve">Figure 4: The New Journal Entry form</w:t>
       </w:r>
     </w:p>
     <w:p>
@@ -963,25 +1071,67 @@
     </w:p>
     <w:p>
       <w:pPr>
+        <w:spacing w:after="20" w:before="100"/>
+        <w:jc w:val="center"/>
+      </w:pPr>
+      <w:r>
+        <w:drawing>
+          <wp:inline distT="0" distB="0" distL="0" distR="0">
+            <wp:extent cx="5715000" cy="3086100"/>
+            <wp:effectExtent t="0" r="0" b="0" l="0"/>
+            <wp:docPr id="1" name="" descr="" title=""/>
+            <wp:cNvGraphicFramePr>
+              <a:graphicFrameLocks xmlns:a="http://schemas.openxmlformats.org/drawingml/2006/main" noChangeAspect="1"/>
+            </wp:cNvGraphicFramePr>
+            <a:graphic xmlns:a="http://schemas.openxmlformats.org/drawingml/2006/main">
+              <a:graphicData uri="http://schemas.openxmlformats.org/drawingml/2006/picture">
+                <pic:pic xmlns:pic="http://schemas.openxmlformats.org/drawingml/2006/picture">
+                  <pic:nvPicPr>
+                    <pic:cNvPr id="0" name="" descr=""/>
+                    <pic:cNvPicPr>
+                      <a:picLocks noChangeAspect="1" noChangeArrowheads="1"/>
+                    </pic:cNvPicPr>
+                  </pic:nvPicPr>
+                  <pic:blipFill>
+                    <a:blip r:embed="rId10" cstate="none"/>
+                    <a:srcRect/>
+                    <a:stretch>
+                      <a:fillRect/>
+                    </a:stretch>
+                  </pic:blipFill>
+                  <pic:spPr bwMode="auto">
+                    <a:xfrm>
+                      <a:off x="0" y="0"/>
+                      <a:ext cx="5715000" cy="3086100"/>
+                    </a:xfrm>
+                    <a:prstGeom prst="rect">
+                      <a:avLst/>
+                    </a:prstGeom>
+                  </pic:spPr>
+                </pic:pic>
+              </a:graphicData>
+            </a:graphic>
+          </wp:inline>
+        </w:drawing>
+      </w:r>
+    </w:p>
+    <w:p>
+      <w:pPr>
         <w:pBdr>
-          <w:top w:val="dashed" w:color="023E71" w:sz="6"/>
-          <w:bottom w:val="dashed" w:color="023E71" w:sz="6"/>
-          <w:left w:val="dashed" w:color="023E71" w:sz="6"/>
-          <w:right w:val="dashed" w:color="023E71" w:sz="6"/>
+          <w:bottom w:val="single" w:color="EEF3F9" w:sz="2"/>
         </w:pBdr>
-        <w:shd w:fill="EEF3F9" w:val="clear"/>
-        <w:spacing w:after="180" w:before="80"/>
+        <w:spacing w:after="200"/>
         <w:jc w:val="center"/>
       </w:pPr>
       <w:r>
         <w:rPr>
           <w:i/>
           <w:iCs/>
-          <w:color w:val="023E71"/>
-          <w:sz w:val="20"/>
-          <w:szCs w:val="20"/>
+          <w:color w:val="667788"/>
+          <w:sz w:val="16"/>
+          <w:szCs w:val="16"/>
         </w:rPr>
-        <w:t xml:space="preserve">[  Screenshot: Day Book  ]</w:t>
+        <w:t xml:space="preserve">Figure 5: The Day Book</w:t>
       </w:r>
     </w:p>
     <w:p>
@@ -1034,25 +1184,67 @@
     </w:p>
     <w:p>
       <w:pPr>
+        <w:spacing w:after="20" w:before="100"/>
+        <w:jc w:val="center"/>
+      </w:pPr>
+      <w:r>
+        <w:drawing>
+          <wp:inline distT="0" distB="0" distL="0" distR="0">
+            <wp:extent cx="5715000" cy="2933700"/>
+            <wp:effectExtent t="0" r="0" b="0" l="0"/>
+            <wp:docPr id="1" name="" descr="" title=""/>
+            <wp:cNvGraphicFramePr>
+              <a:graphicFrameLocks xmlns:a="http://schemas.openxmlformats.org/drawingml/2006/main" noChangeAspect="1"/>
+            </wp:cNvGraphicFramePr>
+            <a:graphic xmlns:a="http://schemas.openxmlformats.org/drawingml/2006/main">
+              <a:graphicData uri="http://schemas.openxmlformats.org/drawingml/2006/picture">
+                <pic:pic xmlns:pic="http://schemas.openxmlformats.org/drawingml/2006/picture">
+                  <pic:nvPicPr>
+                    <pic:cNvPr id="0" name="" descr=""/>
+                    <pic:cNvPicPr>
+                      <a:picLocks noChangeAspect="1" noChangeArrowheads="1"/>
+                    </pic:cNvPicPr>
+                  </pic:nvPicPr>
+                  <pic:blipFill>
+                    <a:blip r:embed="rId11" cstate="none"/>
+                    <a:srcRect/>
+                    <a:stretch>
+                      <a:fillRect/>
+                    </a:stretch>
+                  </pic:blipFill>
+                  <pic:spPr bwMode="auto">
+                    <a:xfrm>
+                      <a:off x="0" y="0"/>
+                      <a:ext cx="5715000" cy="2933700"/>
+                    </a:xfrm>
+                    <a:prstGeom prst="rect">
+                      <a:avLst/>
+                    </a:prstGeom>
+                  </pic:spPr>
+                </pic:pic>
+              </a:graphicData>
+            </a:graphic>
+          </wp:inline>
+        </w:drawing>
+      </w:r>
+    </w:p>
+    <w:p>
+      <w:pPr>
         <w:pBdr>
-          <w:top w:val="dashed" w:color="023E71" w:sz="6"/>
-          <w:bottom w:val="dashed" w:color="023E71" w:sz="6"/>
-          <w:left w:val="dashed" w:color="023E71" w:sz="6"/>
-          <w:right w:val="dashed" w:color="023E71" w:sz="6"/>
+          <w:bottom w:val="single" w:color="EEF3F9" w:sz="2"/>
         </w:pBdr>
-        <w:shd w:fill="EEF3F9" w:val="clear"/>
-        <w:spacing w:after="180" w:before="80"/>
+        <w:spacing w:after="200"/>
         <w:jc w:val="center"/>
       </w:pPr>
       <w:r>
         <w:rPr>
           <w:i/>
           <w:iCs/>
-          <w:color w:val="023E71"/>
-          <w:sz w:val="20"/>
-          <w:szCs w:val="20"/>
+          <w:color w:val="667788"/>
+          <w:sz w:val="16"/>
+          <w:szCs w:val="16"/>
         </w:rPr>
-        <w:t xml:space="preserve">[  Screenshot: Ledger statement with running balance  ]</w:t>
+        <w:t xml:space="preserve">Figure 6: A ledger statement with running balance</w:t>
       </w:r>
     </w:p>
     <w:p>
@@ -1074,25 +1266,67 @@
     </w:p>
     <w:p>
       <w:pPr>
+        <w:spacing w:after="20" w:before="100"/>
+        <w:jc w:val="center"/>
+      </w:pPr>
+      <w:r>
+        <w:drawing>
+          <wp:inline distT="0" distB="0" distL="0" distR="0">
+            <wp:extent cx="5715000" cy="3000375"/>
+            <wp:effectExtent t="0" r="0" b="0" l="0"/>
+            <wp:docPr id="1" name="" descr="" title=""/>
+            <wp:cNvGraphicFramePr>
+              <a:graphicFrameLocks xmlns:a="http://schemas.openxmlformats.org/drawingml/2006/main" noChangeAspect="1"/>
+            </wp:cNvGraphicFramePr>
+            <a:graphic xmlns:a="http://schemas.openxmlformats.org/drawingml/2006/main">
+              <a:graphicData uri="http://schemas.openxmlformats.org/drawingml/2006/picture">
+                <pic:pic xmlns:pic="http://schemas.openxmlformats.org/drawingml/2006/picture">
+                  <pic:nvPicPr>
+                    <pic:cNvPr id="0" name="" descr=""/>
+                    <pic:cNvPicPr>
+                      <a:picLocks noChangeAspect="1" noChangeArrowheads="1"/>
+                    </pic:cNvPicPr>
+                  </pic:nvPicPr>
+                  <pic:blipFill>
+                    <a:blip r:embed="rId12" cstate="none"/>
+                    <a:srcRect/>
+                    <a:stretch>
+                      <a:fillRect/>
+                    </a:stretch>
+                  </pic:blipFill>
+                  <pic:spPr bwMode="auto">
+                    <a:xfrm>
+                      <a:off x="0" y="0"/>
+                      <a:ext cx="5715000" cy="3000375"/>
+                    </a:xfrm>
+                    <a:prstGeom prst="rect">
+                      <a:avLst/>
+                    </a:prstGeom>
+                  </pic:spPr>
+                </pic:pic>
+              </a:graphicData>
+            </a:graphic>
+          </wp:inline>
+        </w:drawing>
+      </w:r>
+    </w:p>
+    <w:p>
+      <w:pPr>
         <w:pBdr>
-          <w:top w:val="dashed" w:color="023E71" w:sz="6"/>
-          <w:bottom w:val="dashed" w:color="023E71" w:sz="6"/>
-          <w:left w:val="dashed" w:color="023E71" w:sz="6"/>
-          <w:right w:val="dashed" w:color="023E71" w:sz="6"/>
+          <w:bottom w:val="single" w:color="EEF3F9" w:sz="2"/>
         </w:pBdr>
-        <w:shd w:fill="EEF3F9" w:val="clear"/>
-        <w:spacing w:after="180" w:before="80"/>
+        <w:spacing w:after="200"/>
         <w:jc w:val="center"/>
       </w:pPr>
       <w:r>
         <w:rPr>
           <w:i/>
           <w:iCs/>
-          <w:color w:val="023E71"/>
-          <w:sz w:val="20"/>
-          <w:szCs w:val="20"/>
+          <w:color w:val="667788"/>
+          <w:sz w:val="16"/>
+          <w:szCs w:val="16"/>
         </w:rPr>
-        <w:t xml:space="preserve">[  Screenshot: Profit &amp; Loss and Balance Sheet  ]</w:t>
+        <w:t xml:space="preserve">Figure 7: Profit &amp; Loss and Balance Sheet</w:t>
       </w:r>
     </w:p>
     <w:p>
@@ -1137,25 +1371,67 @@
     </w:p>
     <w:p>
       <w:pPr>
+        <w:spacing w:after="20" w:before="100"/>
+        <w:jc w:val="center"/>
+      </w:pPr>
+      <w:r>
+        <w:drawing>
+          <wp:inline distT="0" distB="0" distL="0" distR="0">
+            <wp:extent cx="5715000" cy="2933700"/>
+            <wp:effectExtent t="0" r="0" b="0" l="0"/>
+            <wp:docPr id="1" name="" descr="" title=""/>
+            <wp:cNvGraphicFramePr>
+              <a:graphicFrameLocks xmlns:a="http://schemas.openxmlformats.org/drawingml/2006/main" noChangeAspect="1"/>
+            </wp:cNvGraphicFramePr>
+            <a:graphic xmlns:a="http://schemas.openxmlformats.org/drawingml/2006/main">
+              <a:graphicData uri="http://schemas.openxmlformats.org/drawingml/2006/picture">
+                <pic:pic xmlns:pic="http://schemas.openxmlformats.org/drawingml/2006/picture">
+                  <pic:nvPicPr>
+                    <pic:cNvPr id="0" name="" descr=""/>
+                    <pic:cNvPicPr>
+                      <a:picLocks noChangeAspect="1" noChangeArrowheads="1"/>
+                    </pic:cNvPicPr>
+                  </pic:nvPicPr>
+                  <pic:blipFill>
+                    <a:blip r:embed="rId13" cstate="none"/>
+                    <a:srcRect/>
+                    <a:stretch>
+                      <a:fillRect/>
+                    </a:stretch>
+                  </pic:blipFill>
+                  <pic:spPr bwMode="auto">
+                    <a:xfrm>
+                      <a:off x="0" y="0"/>
+                      <a:ext cx="5715000" cy="2933700"/>
+                    </a:xfrm>
+                    <a:prstGeom prst="rect">
+                      <a:avLst/>
+                    </a:prstGeom>
+                  </pic:spPr>
+                </pic:pic>
+              </a:graphicData>
+            </a:graphic>
+          </wp:inline>
+        </w:drawing>
+      </w:r>
+    </w:p>
+    <w:p>
+      <w:pPr>
         <w:pBdr>
-          <w:top w:val="dashed" w:color="023E71" w:sz="6"/>
-          <w:bottom w:val="dashed" w:color="023E71" w:sz="6"/>
-          <w:left w:val="dashed" w:color="023E71" w:sz="6"/>
-          <w:right w:val="dashed" w:color="023E71" w:sz="6"/>
+          <w:bottom w:val="single" w:color="EEF3F9" w:sz="2"/>
         </w:pBdr>
-        <w:shd w:fill="EEF3F9" w:val="clear"/>
-        <w:spacing w:after="180" w:before="80"/>
+        <w:spacing w:after="200"/>
         <w:jc w:val="center"/>
       </w:pPr>
       <w:r>
         <w:rPr>
           <w:i/>
           <w:iCs/>
-          <w:color w:val="023E71"/>
-          <w:sz w:val="20"/>
-          <w:szCs w:val="20"/>
+          <w:color w:val="667788"/>
+          <w:sz w:val="16"/>
+          <w:szCs w:val="16"/>
         </w:rPr>
-        <w:t xml:space="preserve">[  Screenshot: VAT report  ]</w:t>
+        <w:t xml:space="preserve">Figure 8: The VAT report</w:t>
       </w:r>
     </w:p>
     <w:p>
@@ -1244,25 +1520,67 @@
     </w:p>
     <w:p>
       <w:pPr>
+        <w:spacing w:after="20" w:before="100"/>
+        <w:jc w:val="center"/>
+      </w:pPr>
+      <w:r>
+        <w:drawing>
+          <wp:inline distT="0" distB="0" distL="0" distR="0">
+            <wp:extent cx="5715000" cy="2971800"/>
+            <wp:effectExtent t="0" r="0" b="0" l="0"/>
+            <wp:docPr id="1" name="" descr="" title=""/>
+            <wp:cNvGraphicFramePr>
+              <a:graphicFrameLocks xmlns:a="http://schemas.openxmlformats.org/drawingml/2006/main" noChangeAspect="1"/>
+            </wp:cNvGraphicFramePr>
+            <a:graphic xmlns:a="http://schemas.openxmlformats.org/drawingml/2006/main">
+              <a:graphicData uri="http://schemas.openxmlformats.org/drawingml/2006/picture">
+                <pic:pic xmlns:pic="http://schemas.openxmlformats.org/drawingml/2006/picture">
+                  <pic:nvPicPr>
+                    <pic:cNvPr id="0" name="" descr=""/>
+                    <pic:cNvPicPr>
+                      <a:picLocks noChangeAspect="1" noChangeArrowheads="1"/>
+                    </pic:cNvPicPr>
+                  </pic:nvPicPr>
+                  <pic:blipFill>
+                    <a:blip r:embed="rId14" cstate="none"/>
+                    <a:srcRect/>
+                    <a:stretch>
+                      <a:fillRect/>
+                    </a:stretch>
+                  </pic:blipFill>
+                  <pic:spPr bwMode="auto">
+                    <a:xfrm>
+                      <a:off x="0" y="0"/>
+                      <a:ext cx="5715000" cy="2971800"/>
+                    </a:xfrm>
+                    <a:prstGeom prst="rect">
+                      <a:avLst/>
+                    </a:prstGeom>
+                  </pic:spPr>
+                </pic:pic>
+              </a:graphicData>
+            </a:graphic>
+          </wp:inline>
+        </w:drawing>
+      </w:r>
+    </w:p>
+    <w:p>
+      <w:pPr>
         <w:pBdr>
-          <w:top w:val="dashed" w:color="023E71" w:sz="6"/>
-          <w:bottom w:val="dashed" w:color="023E71" w:sz="6"/>
-          <w:left w:val="dashed" w:color="023E71" w:sz="6"/>
-          <w:right w:val="dashed" w:color="023E71" w:sz="6"/>
+          <w:bottom w:val="single" w:color="EEF3F9" w:sz="2"/>
         </w:pBdr>
-        <w:shd w:fill="EEF3F9" w:val="clear"/>
-        <w:spacing w:after="180" w:before="80"/>
+        <w:spacing w:after="200"/>
         <w:jc w:val="center"/>
       </w:pPr>
       <w:r>
         <w:rPr>
           <w:i/>
           <w:iCs/>
-          <w:color w:val="023E71"/>
-          <w:sz w:val="20"/>
-          <w:szCs w:val="20"/>
+          <w:color w:val="667788"/>
+          <w:sz w:val="16"/>
+          <w:szCs w:val="16"/>
         </w:rPr>
-        <w:t xml:space="preserve">[  Screenshot: Tally Sync page  ]</w:t>
+        <w:t xml:space="preserve">Figure 9: The Tally Sync page</w:t>
       </w:r>
     </w:p>
     <w:p>
@@ -1368,25 +1686,67 @@
     </w:p>
     <w:p>
       <w:pPr>
+        <w:spacing w:after="20" w:before="100"/>
+        <w:jc w:val="center"/>
+      </w:pPr>
+      <w:r>
+        <w:drawing>
+          <wp:inline distT="0" distB="0" distL="0" distR="0">
+            <wp:extent cx="5715000" cy="3171825"/>
+            <wp:effectExtent t="0" r="0" b="0" l="0"/>
+            <wp:docPr id="1" name="" descr="" title=""/>
+            <wp:cNvGraphicFramePr>
+              <a:graphicFrameLocks xmlns:a="http://schemas.openxmlformats.org/drawingml/2006/main" noChangeAspect="1"/>
+            </wp:cNvGraphicFramePr>
+            <a:graphic xmlns:a="http://schemas.openxmlformats.org/drawingml/2006/main">
+              <a:graphicData uri="http://schemas.openxmlformats.org/drawingml/2006/picture">
+                <pic:pic xmlns:pic="http://schemas.openxmlformats.org/drawingml/2006/picture">
+                  <pic:nvPicPr>
+                    <pic:cNvPr id="0" name="" descr=""/>
+                    <pic:cNvPicPr>
+                      <a:picLocks noChangeAspect="1" noChangeArrowheads="1"/>
+                    </pic:cNvPicPr>
+                  </pic:nvPicPr>
+                  <pic:blipFill>
+                    <a:blip r:embed="rId15" cstate="none"/>
+                    <a:srcRect/>
+                    <a:stretch>
+                      <a:fillRect/>
+                    </a:stretch>
+                  </pic:blipFill>
+                  <pic:spPr bwMode="auto">
+                    <a:xfrm>
+                      <a:off x="0" y="0"/>
+                      <a:ext cx="5715000" cy="3171825"/>
+                    </a:xfrm>
+                    <a:prstGeom prst="rect">
+                      <a:avLst/>
+                    </a:prstGeom>
+                  </pic:spPr>
+                </pic:pic>
+              </a:graphicData>
+            </a:graphic>
+          </wp:inline>
+        </w:drawing>
+      </w:r>
+    </w:p>
+    <w:p>
+      <w:pPr>
         <w:pBdr>
-          <w:top w:val="dashed" w:color="023E71" w:sz="6"/>
-          <w:bottom w:val="dashed" w:color="023E71" w:sz="6"/>
-          <w:left w:val="dashed" w:color="023E71" w:sz="6"/>
-          <w:right w:val="dashed" w:color="023E71" w:sz="6"/>
+          <w:bottom w:val="single" w:color="EEF3F9" w:sz="2"/>
         </w:pBdr>
-        <w:shd w:fill="EEF3F9" w:val="clear"/>
-        <w:spacing w:after="180" w:before="80"/>
+        <w:spacing w:after="200"/>
         <w:jc w:val="center"/>
       </w:pPr>
       <w:r>
         <w:rPr>
           <w:i/>
           <w:iCs/>
-          <w:color w:val="023E71"/>
-          <w:sz w:val="20"/>
-          <w:szCs w:val="20"/>
+          <w:color w:val="667788"/>
+          <w:sz w:val="16"/>
+          <w:szCs w:val="16"/>
         </w:rPr>
-        <w:t xml:space="preserve">[  Screenshot: Employees list and an employee profile  ]</w:t>
+        <w:t xml:space="preserve">Figure 10: The Employees list</w:t>
       </w:r>
     </w:p>
     <w:p>
@@ -1439,25 +1799,67 @@
     </w:p>
     <w:p>
       <w:pPr>
+        <w:spacing w:after="20" w:before="100"/>
+        <w:jc w:val="center"/>
+      </w:pPr>
+      <w:r>
+        <w:drawing>
+          <wp:inline distT="0" distB="0" distL="0" distR="0">
+            <wp:extent cx="5715000" cy="3257550"/>
+            <wp:effectExtent t="0" r="0" b="0" l="0"/>
+            <wp:docPr id="1" name="" descr="" title=""/>
+            <wp:cNvGraphicFramePr>
+              <a:graphicFrameLocks xmlns:a="http://schemas.openxmlformats.org/drawingml/2006/main" noChangeAspect="1"/>
+            </wp:cNvGraphicFramePr>
+            <a:graphic xmlns:a="http://schemas.openxmlformats.org/drawingml/2006/main">
+              <a:graphicData uri="http://schemas.openxmlformats.org/drawingml/2006/picture">
+                <pic:pic xmlns:pic="http://schemas.openxmlformats.org/drawingml/2006/picture">
+                  <pic:nvPicPr>
+                    <pic:cNvPr id="0" name="" descr=""/>
+                    <pic:cNvPicPr>
+                      <a:picLocks noChangeAspect="1" noChangeArrowheads="1"/>
+                    </pic:cNvPicPr>
+                  </pic:nvPicPr>
+                  <pic:blipFill>
+                    <a:blip r:embed="rId16" cstate="none"/>
+                    <a:srcRect/>
+                    <a:stretch>
+                      <a:fillRect/>
+                    </a:stretch>
+                  </pic:blipFill>
+                  <pic:spPr bwMode="auto">
+                    <a:xfrm>
+                      <a:off x="0" y="0"/>
+                      <a:ext cx="5715000" cy="3257550"/>
+                    </a:xfrm>
+                    <a:prstGeom prst="rect">
+                      <a:avLst/>
+                    </a:prstGeom>
+                  </pic:spPr>
+                </pic:pic>
+              </a:graphicData>
+            </a:graphic>
+          </wp:inline>
+        </w:drawing>
+      </w:r>
+    </w:p>
+    <w:p>
+      <w:pPr>
         <w:pBdr>
-          <w:top w:val="dashed" w:color="023E71" w:sz="6"/>
-          <w:bottom w:val="dashed" w:color="023E71" w:sz="6"/>
-          <w:left w:val="dashed" w:color="023E71" w:sz="6"/>
-          <w:right w:val="dashed" w:color="023E71" w:sz="6"/>
+          <w:bottom w:val="single" w:color="EEF3F9" w:sz="2"/>
         </w:pBdr>
-        <w:shd w:fill="EEF3F9" w:val="clear"/>
-        <w:spacing w:after="180" w:before="80"/>
+        <w:spacing w:after="200"/>
         <w:jc w:val="center"/>
       </w:pPr>
       <w:r>
         <w:rPr>
           <w:i/>
           <w:iCs/>
-          <w:color w:val="023E71"/>
-          <w:sz w:val="20"/>
-          <w:szCs w:val="20"/>
+          <w:color w:val="667788"/>
+          <w:sz w:val="16"/>
+          <w:szCs w:val="16"/>
         </w:rPr>
-        <w:t xml:space="preserve">[  Screenshot: Onboarding  ]</w:t>
+        <w:t xml:space="preserve">Figure 11: Onboarding — raising a requisition</w:t>
       </w:r>
     </w:p>
     <w:p>
@@ -1510,25 +1912,67 @@
     </w:p>
     <w:p>
       <w:pPr>
+        <w:spacing w:after="20" w:before="100"/>
+        <w:jc w:val="center"/>
+      </w:pPr>
+      <w:r>
+        <w:drawing>
+          <wp:inline distT="0" distB="0" distL="0" distR="0">
+            <wp:extent cx="5715000" cy="3171825"/>
+            <wp:effectExtent t="0" r="0" b="0" l="0"/>
+            <wp:docPr id="1" name="" descr="" title=""/>
+            <wp:cNvGraphicFramePr>
+              <a:graphicFrameLocks xmlns:a="http://schemas.openxmlformats.org/drawingml/2006/main" noChangeAspect="1"/>
+            </wp:cNvGraphicFramePr>
+            <a:graphic xmlns:a="http://schemas.openxmlformats.org/drawingml/2006/main">
+              <a:graphicData uri="http://schemas.openxmlformats.org/drawingml/2006/picture">
+                <pic:pic xmlns:pic="http://schemas.openxmlformats.org/drawingml/2006/picture">
+                  <pic:nvPicPr>
+                    <pic:cNvPr id="0" name="" descr=""/>
+                    <pic:cNvPicPr>
+                      <a:picLocks noChangeAspect="1" noChangeArrowheads="1"/>
+                    </pic:cNvPicPr>
+                  </pic:nvPicPr>
+                  <pic:blipFill>
+                    <a:blip r:embed="rId17" cstate="none"/>
+                    <a:srcRect/>
+                    <a:stretch>
+                      <a:fillRect/>
+                    </a:stretch>
+                  </pic:blipFill>
+                  <pic:spPr bwMode="auto">
+                    <a:xfrm>
+                      <a:off x="0" y="0"/>
+                      <a:ext cx="5715000" cy="3171825"/>
+                    </a:xfrm>
+                    <a:prstGeom prst="rect">
+                      <a:avLst/>
+                    </a:prstGeom>
+                  </pic:spPr>
+                </pic:pic>
+              </a:graphicData>
+            </a:graphic>
+          </wp:inline>
+        </w:drawing>
+      </w:r>
+    </w:p>
+    <w:p>
+      <w:pPr>
         <w:pBdr>
-          <w:top w:val="dashed" w:color="023E71" w:sz="6"/>
-          <w:bottom w:val="dashed" w:color="023E71" w:sz="6"/>
-          <w:left w:val="dashed" w:color="023E71" w:sz="6"/>
-          <w:right w:val="dashed" w:color="023E71" w:sz="6"/>
+          <w:bottom w:val="single" w:color="EEF3F9" w:sz="2"/>
         </w:pBdr>
-        <w:shd w:fill="EEF3F9" w:val="clear"/>
-        <w:spacing w:after="180" w:before="80"/>
+        <w:spacing w:after="200"/>
         <w:jc w:val="center"/>
       </w:pPr>
       <w:r>
         <w:rPr>
           <w:i/>
           <w:iCs/>
-          <w:color w:val="023E71"/>
-          <w:sz w:val="20"/>
-          <w:szCs w:val="20"/>
+          <w:color w:val="667788"/>
+          <w:sz w:val="16"/>
+          <w:szCs w:val="16"/>
         </w:rPr>
-        <w:t xml:space="preserve">[  Screenshot: Payroll run and payslips  ]</w:t>
+        <w:t xml:space="preserve">Figure 12: Payroll runs and payslips</w:t>
       </w:r>
     </w:p>
     <w:p>
@@ -1550,25 +1994,67 @@
     </w:p>
     <w:p>
       <w:pPr>
+        <w:spacing w:after="20" w:before="100"/>
+        <w:jc w:val="center"/>
+      </w:pPr>
+      <w:r>
+        <w:drawing>
+          <wp:inline distT="0" distB="0" distL="0" distR="0">
+            <wp:extent cx="5715000" cy="3076575"/>
+            <wp:effectExtent t="0" r="0" b="0" l="0"/>
+            <wp:docPr id="1" name="" descr="" title=""/>
+            <wp:cNvGraphicFramePr>
+              <a:graphicFrameLocks xmlns:a="http://schemas.openxmlformats.org/drawingml/2006/main" noChangeAspect="1"/>
+            </wp:cNvGraphicFramePr>
+            <a:graphic xmlns:a="http://schemas.openxmlformats.org/drawingml/2006/main">
+              <a:graphicData uri="http://schemas.openxmlformats.org/drawingml/2006/picture">
+                <pic:pic xmlns:pic="http://schemas.openxmlformats.org/drawingml/2006/picture">
+                  <pic:nvPicPr>
+                    <pic:cNvPr id="0" name="" descr=""/>
+                    <pic:cNvPicPr>
+                      <a:picLocks noChangeAspect="1" noChangeArrowheads="1"/>
+                    </pic:cNvPicPr>
+                  </pic:nvPicPr>
+                  <pic:blipFill>
+                    <a:blip r:embed="rId18" cstate="none"/>
+                    <a:srcRect/>
+                    <a:stretch>
+                      <a:fillRect/>
+                    </a:stretch>
+                  </pic:blipFill>
+                  <pic:spPr bwMode="auto">
+                    <a:xfrm>
+                      <a:off x="0" y="0"/>
+                      <a:ext cx="5715000" cy="3076575"/>
+                    </a:xfrm>
+                    <a:prstGeom prst="rect">
+                      <a:avLst/>
+                    </a:prstGeom>
+                  </pic:spPr>
+                </pic:pic>
+              </a:graphicData>
+            </a:graphic>
+          </wp:inline>
+        </w:drawing>
+      </w:r>
+    </w:p>
+    <w:p>
+      <w:pPr>
         <w:pBdr>
-          <w:top w:val="dashed" w:color="023E71" w:sz="6"/>
-          <w:bottom w:val="dashed" w:color="023E71" w:sz="6"/>
-          <w:left w:val="dashed" w:color="023E71" w:sz="6"/>
-          <w:right w:val="dashed" w:color="023E71" w:sz="6"/>
+          <w:bottom w:val="single" w:color="EEF3F9" w:sz="2"/>
         </w:pBdr>
-        <w:shd w:fill="EEF3F9" w:val="clear"/>
-        <w:spacing w:after="180" w:before="80"/>
+        <w:spacing w:after="200"/>
         <w:jc w:val="center"/>
       </w:pPr>
       <w:r>
         <w:rPr>
           <w:i/>
           <w:iCs/>
-          <w:color w:val="023E71"/>
-          <w:sz w:val="20"/>
-          <w:szCs w:val="20"/>
+          <w:color w:val="667788"/>
+          <w:sz w:val="16"/>
+          <w:szCs w:val="16"/>
         </w:rPr>
-        <w:t xml:space="preserve">[  Screenshot: Leave requests  ]</w:t>
+        <w:t xml:space="preserve">Figure 13: Leave requests and balances</w:t>
       </w:r>
     </w:p>
     <w:p>
@@ -1642,25 +2128,67 @@
     </w:p>
     <w:p>
       <w:pPr>
+        <w:spacing w:after="20" w:before="100"/>
+        <w:jc w:val="center"/>
+      </w:pPr>
+      <w:r>
+        <w:drawing>
+          <wp:inline distT="0" distB="0" distL="0" distR="0">
+            <wp:extent cx="5715000" cy="3219450"/>
+            <wp:effectExtent t="0" r="0" b="0" l="0"/>
+            <wp:docPr id="1" name="" descr="" title=""/>
+            <wp:cNvGraphicFramePr>
+              <a:graphicFrameLocks xmlns:a="http://schemas.openxmlformats.org/drawingml/2006/main" noChangeAspect="1"/>
+            </wp:cNvGraphicFramePr>
+            <a:graphic xmlns:a="http://schemas.openxmlformats.org/drawingml/2006/main">
+              <a:graphicData uri="http://schemas.openxmlformats.org/drawingml/2006/picture">
+                <pic:pic xmlns:pic="http://schemas.openxmlformats.org/drawingml/2006/picture">
+                  <pic:nvPicPr>
+                    <pic:cNvPr id="0" name="" descr=""/>
+                    <pic:cNvPicPr>
+                      <a:picLocks noChangeAspect="1" noChangeArrowheads="1"/>
+                    </pic:cNvPicPr>
+                  </pic:nvPicPr>
+                  <pic:blipFill>
+                    <a:blip r:embed="rId19" cstate="none"/>
+                    <a:srcRect/>
+                    <a:stretch>
+                      <a:fillRect/>
+                    </a:stretch>
+                  </pic:blipFill>
+                  <pic:spPr bwMode="auto">
+                    <a:xfrm>
+                      <a:off x="0" y="0"/>
+                      <a:ext cx="5715000" cy="3219450"/>
+                    </a:xfrm>
+                    <a:prstGeom prst="rect">
+                      <a:avLst/>
+                    </a:prstGeom>
+                  </pic:spPr>
+                </pic:pic>
+              </a:graphicData>
+            </a:graphic>
+          </wp:inline>
+        </w:drawing>
+      </w:r>
+    </w:p>
+    <w:p>
+      <w:pPr>
         <w:pBdr>
-          <w:top w:val="dashed" w:color="023E71" w:sz="6"/>
-          <w:bottom w:val="dashed" w:color="023E71" w:sz="6"/>
-          <w:left w:val="dashed" w:color="023E71" w:sz="6"/>
-          <w:right w:val="dashed" w:color="023E71" w:sz="6"/>
+          <w:bottom w:val="single" w:color="EEF3F9" w:sz="2"/>
         </w:pBdr>
-        <w:shd w:fill="EEF3F9" w:val="clear"/>
-        <w:spacing w:after="180" w:before="80"/>
+        <w:spacing w:after="200"/>
         <w:jc w:val="center"/>
       </w:pPr>
       <w:r>
         <w:rPr>
           <w:i/>
           <w:iCs/>
-          <w:color w:val="023E71"/>
-          <w:sz w:val="20"/>
-          <w:szCs w:val="20"/>
+          <w:color w:val="667788"/>
+          <w:sz w:val="16"/>
+          <w:szCs w:val="16"/>
         </w:rPr>
-        <w:t xml:space="preserve">[  Screenshot: Daily Muster  ]</w:t>
+        <w:t xml:space="preserve">Figure 14: The Daily Muster</w:t>
       </w:r>
     </w:p>
     <w:p>
@@ -1726,25 +2254,67 @@
     </w:p>
     <w:p>
       <w:pPr>
+        <w:spacing w:after="20" w:before="100"/>
+        <w:jc w:val="center"/>
+      </w:pPr>
+      <w:r>
+        <w:drawing>
+          <wp:inline distT="0" distB="0" distL="0" distR="0">
+            <wp:extent cx="5715000" cy="2990850"/>
+            <wp:effectExtent t="0" r="0" b="0" l="0"/>
+            <wp:docPr id="1" name="" descr="" title=""/>
+            <wp:cNvGraphicFramePr>
+              <a:graphicFrameLocks xmlns:a="http://schemas.openxmlformats.org/drawingml/2006/main" noChangeAspect="1"/>
+            </wp:cNvGraphicFramePr>
+            <a:graphic xmlns:a="http://schemas.openxmlformats.org/drawingml/2006/main">
+              <a:graphicData uri="http://schemas.openxmlformats.org/drawingml/2006/picture">
+                <pic:pic xmlns:pic="http://schemas.openxmlformats.org/drawingml/2006/picture">
+                  <pic:nvPicPr>
+                    <pic:cNvPr id="0" name="" descr=""/>
+                    <pic:cNvPicPr>
+                      <a:picLocks noChangeAspect="1" noChangeArrowheads="1"/>
+                    </pic:cNvPicPr>
+                  </pic:nvPicPr>
+                  <pic:blipFill>
+                    <a:blip r:embed="rId20" cstate="none"/>
+                    <a:srcRect/>
+                    <a:stretch>
+                      <a:fillRect/>
+                    </a:stretch>
+                  </pic:blipFill>
+                  <pic:spPr bwMode="auto">
+                    <a:xfrm>
+                      <a:off x="0" y="0"/>
+                      <a:ext cx="5715000" cy="2990850"/>
+                    </a:xfrm>
+                    <a:prstGeom prst="rect">
+                      <a:avLst/>
+                    </a:prstGeom>
+                  </pic:spPr>
+                </pic:pic>
+              </a:graphicData>
+            </a:graphic>
+          </wp:inline>
+        </w:drawing>
+      </w:r>
+    </w:p>
+    <w:p>
+      <w:pPr>
         <w:pBdr>
-          <w:top w:val="dashed" w:color="023E71" w:sz="6"/>
-          <w:bottom w:val="dashed" w:color="023E71" w:sz="6"/>
-          <w:left w:val="dashed" w:color="023E71" w:sz="6"/>
-          <w:right w:val="dashed" w:color="023E71" w:sz="6"/>
+          <w:bottom w:val="single" w:color="EEF3F9" w:sz="2"/>
         </w:pBdr>
-        <w:shd w:fill="EEF3F9" w:val="clear"/>
-        <w:spacing w:after="180" w:before="80"/>
+        <w:spacing w:after="200"/>
         <w:jc w:val="center"/>
       </w:pPr>
       <w:r>
         <w:rPr>
           <w:i/>
           <w:iCs/>
-          <w:color w:val="023E71"/>
-          <w:sz w:val="20"/>
-          <w:szCs w:val="20"/>
+          <w:color w:val="667788"/>
+          <w:sz w:val="16"/>
+          <w:szCs w:val="16"/>
         </w:rPr>
-        <w:t xml:space="preserve">[  Screenshot: Import from punch machine  ]</w:t>
+        <w:t xml:space="preserve">Figure 15: Import from punch machine</w:t>
       </w:r>
     </w:p>
     <w:p>
@@ -1766,25 +2336,67 @@
     </w:p>
     <w:p>
       <w:pPr>
+        <w:spacing w:after="20" w:before="100"/>
+        <w:jc w:val="center"/>
+      </w:pPr>
+      <w:r>
+        <w:drawing>
+          <wp:inline distT="0" distB="0" distL="0" distR="0">
+            <wp:extent cx="5715000" cy="3238500"/>
+            <wp:effectExtent t="0" r="0" b="0" l="0"/>
+            <wp:docPr id="1" name="" descr="" title=""/>
+            <wp:cNvGraphicFramePr>
+              <a:graphicFrameLocks xmlns:a="http://schemas.openxmlformats.org/drawingml/2006/main" noChangeAspect="1"/>
+            </wp:cNvGraphicFramePr>
+            <a:graphic xmlns:a="http://schemas.openxmlformats.org/drawingml/2006/main">
+              <a:graphicData uri="http://schemas.openxmlformats.org/drawingml/2006/picture">
+                <pic:pic xmlns:pic="http://schemas.openxmlformats.org/drawingml/2006/picture">
+                  <pic:nvPicPr>
+                    <pic:cNvPr id="0" name="" descr=""/>
+                    <pic:cNvPicPr>
+                      <a:picLocks noChangeAspect="1" noChangeArrowheads="1"/>
+                    </pic:cNvPicPr>
+                  </pic:nvPicPr>
+                  <pic:blipFill>
+                    <a:blip r:embed="rId21" cstate="none"/>
+                    <a:srcRect/>
+                    <a:stretch>
+                      <a:fillRect/>
+                    </a:stretch>
+                  </pic:blipFill>
+                  <pic:spPr bwMode="auto">
+                    <a:xfrm>
+                      <a:off x="0" y="0"/>
+                      <a:ext cx="5715000" cy="3238500"/>
+                    </a:xfrm>
+                    <a:prstGeom prst="rect">
+                      <a:avLst/>
+                    </a:prstGeom>
+                  </pic:spPr>
+                </pic:pic>
+              </a:graphicData>
+            </a:graphic>
+          </wp:inline>
+        </w:drawing>
+      </w:r>
+    </w:p>
+    <w:p>
+      <w:pPr>
         <w:pBdr>
-          <w:top w:val="dashed" w:color="023E71" w:sz="6"/>
-          <w:bottom w:val="dashed" w:color="023E71" w:sz="6"/>
-          <w:left w:val="dashed" w:color="023E71" w:sz="6"/>
-          <w:right w:val="dashed" w:color="023E71" w:sz="6"/>
+          <w:bottom w:val="single" w:color="EEF3F9" w:sz="2"/>
         </w:pBdr>
-        <w:shd w:fill="EEF3F9" w:val="clear"/>
-        <w:spacing w:after="180" w:before="80"/>
+        <w:spacing w:after="200"/>
         <w:jc w:val="center"/>
       </w:pPr>
       <w:r>
         <w:rPr>
           <w:i/>
           <w:iCs/>
-          <w:color w:val="023E71"/>
-          <w:sz w:val="20"/>
-          <w:szCs w:val="20"/>
+          <w:color w:val="667788"/>
+          <w:sz w:val="16"/>
+          <w:szCs w:val="16"/>
         </w:rPr>
-        <w:t xml:space="preserve">[  Screenshot: Certifications  ]</w:t>
+        <w:t xml:space="preserve">Figure 16: Certifications with expiry status</w:t>
       </w:r>
     </w:p>
     <w:p>
@@ -1858,25 +2470,67 @@
     </w:p>
     <w:p>
       <w:pPr>
+        <w:spacing w:after="20" w:before="100"/>
+        <w:jc w:val="center"/>
+      </w:pPr>
+      <w:r>
+        <w:drawing>
+          <wp:inline distT="0" distB="0" distL="0" distR="0">
+            <wp:extent cx="5715000" cy="2981325"/>
+            <wp:effectExtent t="0" r="0" b="0" l="0"/>
+            <wp:docPr id="1" name="" descr="" title=""/>
+            <wp:cNvGraphicFramePr>
+              <a:graphicFrameLocks xmlns:a="http://schemas.openxmlformats.org/drawingml/2006/main" noChangeAspect="1"/>
+            </wp:cNvGraphicFramePr>
+            <a:graphic xmlns:a="http://schemas.openxmlformats.org/drawingml/2006/main">
+              <a:graphicData uri="http://schemas.openxmlformats.org/drawingml/2006/picture">
+                <pic:pic xmlns:pic="http://schemas.openxmlformats.org/drawingml/2006/picture">
+                  <pic:nvPicPr>
+                    <pic:cNvPr id="0" name="" descr=""/>
+                    <pic:cNvPicPr>
+                      <a:picLocks noChangeAspect="1" noChangeArrowheads="1"/>
+                    </pic:cNvPicPr>
+                  </pic:nvPicPr>
+                  <pic:blipFill>
+                    <a:blip r:embed="rId22" cstate="none"/>
+                    <a:srcRect/>
+                    <a:stretch>
+                      <a:fillRect/>
+                    </a:stretch>
+                  </pic:blipFill>
+                  <pic:spPr bwMode="auto">
+                    <a:xfrm>
+                      <a:off x="0" y="0"/>
+                      <a:ext cx="5715000" cy="2981325"/>
+                    </a:xfrm>
+                    <a:prstGeom prst="rect">
+                      <a:avLst/>
+                    </a:prstGeom>
+                  </pic:spPr>
+                </pic:pic>
+              </a:graphicData>
+            </a:graphic>
+          </wp:inline>
+        </w:drawing>
+      </w:r>
+    </w:p>
+    <w:p>
+      <w:pPr>
         <w:pBdr>
-          <w:top w:val="dashed" w:color="023E71" w:sz="6"/>
-          <w:bottom w:val="dashed" w:color="023E71" w:sz="6"/>
-          <w:left w:val="dashed" w:color="023E71" w:sz="6"/>
-          <w:right w:val="dashed" w:color="023E71" w:sz="6"/>
+          <w:bottom w:val="single" w:color="EEF3F9" w:sz="2"/>
         </w:pBdr>
-        <w:shd w:fill="EEF3F9" w:val="clear"/>
-        <w:spacing w:after="180" w:before="80"/>
+        <w:spacing w:after="200"/>
         <w:jc w:val="center"/>
       </w:pPr>
       <w:r>
         <w:rPr>
           <w:i/>
           <w:iCs/>
-          <w:color w:val="023E71"/>
-          <w:sz w:val="20"/>
-          <w:szCs w:val="20"/>
+          <w:color w:val="667788"/>
+          <w:sz w:val="16"/>
+          <w:szCs w:val="16"/>
         </w:rPr>
-        <w:t xml:space="preserve">[  Screenshot: Separation &amp; Settlement with the live calculation  ]</w:t>
+        <w:t xml:space="preserve">Figure 17: Separation &amp; Settlement with the live calculation</w:t>
       </w:r>
     </w:p>
     <w:p>
@@ -2003,25 +2657,67 @@
     </w:p>
     <w:p>
       <w:pPr>
+        <w:spacing w:after="20" w:before="100"/>
+        <w:jc w:val="center"/>
+      </w:pPr>
+      <w:r>
+        <w:drawing>
+          <wp:inline distT="0" distB="0" distL="0" distR="0">
+            <wp:extent cx="5715000" cy="4191000"/>
+            <wp:effectExtent t="0" r="0" b="0" l="0"/>
+            <wp:docPr id="1" name="" descr="" title=""/>
+            <wp:cNvGraphicFramePr>
+              <a:graphicFrameLocks xmlns:a="http://schemas.openxmlformats.org/drawingml/2006/main" noChangeAspect="1"/>
+            </wp:cNvGraphicFramePr>
+            <a:graphic xmlns:a="http://schemas.openxmlformats.org/drawingml/2006/main">
+              <a:graphicData uri="http://schemas.openxmlformats.org/drawingml/2006/picture">
+                <pic:pic xmlns:pic="http://schemas.openxmlformats.org/drawingml/2006/picture">
+                  <pic:nvPicPr>
+                    <pic:cNvPr id="0" name="" descr=""/>
+                    <pic:cNvPicPr>
+                      <a:picLocks noChangeAspect="1" noChangeArrowheads="1"/>
+                    </pic:cNvPicPr>
+                  </pic:nvPicPr>
+                  <pic:blipFill>
+                    <a:blip r:embed="rId23" cstate="none"/>
+                    <a:srcRect/>
+                    <a:stretch>
+                      <a:fillRect/>
+                    </a:stretch>
+                  </pic:blipFill>
+                  <pic:spPr bwMode="auto">
+                    <a:xfrm>
+                      <a:off x="0" y="0"/>
+                      <a:ext cx="5715000" cy="4191000"/>
+                    </a:xfrm>
+                    <a:prstGeom prst="rect">
+                      <a:avLst/>
+                    </a:prstGeom>
+                  </pic:spPr>
+                </pic:pic>
+              </a:graphicData>
+            </a:graphic>
+          </wp:inline>
+        </w:drawing>
+      </w:r>
+    </w:p>
+    <w:p>
+      <w:pPr>
         <w:pBdr>
-          <w:top w:val="dashed" w:color="023E71" w:sz="6"/>
-          <w:bottom w:val="dashed" w:color="023E71" w:sz="6"/>
-          <w:left w:val="dashed" w:color="023E71" w:sz="6"/>
-          <w:right w:val="dashed" w:color="023E71" w:sz="6"/>
+          <w:bottom w:val="single" w:color="EEF3F9" w:sz="2"/>
         </w:pBdr>
-        <w:shd w:fill="EEF3F9" w:val="clear"/>
-        <w:spacing w:after="180" w:before="80"/>
+        <w:spacing w:after="200"/>
         <w:jc w:val="center"/>
       </w:pPr>
       <w:r>
         <w:rPr>
           <w:i/>
           <w:iCs/>
-          <w:color w:val="023E71"/>
-          <w:sz w:val="20"/>
-          <w:szCs w:val="20"/>
+          <w:color w:val="667788"/>
+          <w:sz w:val="16"/>
+          <w:szCs w:val="16"/>
         </w:rPr>
-        <w:t xml:space="preserve">[  Screenshot: Full &amp; Final Settlement Statement (print view)  ]</w:t>
+        <w:t xml:space="preserve">Figure 18: The Full &amp; Final Settlement Statement (print view)</w:t>
       </w:r>
     </w:p>
     <w:p>
@@ -2066,25 +2762,67 @@
     </w:p>
     <w:p>
       <w:pPr>
+        <w:spacing w:after="20" w:before="100"/>
+        <w:jc w:val="center"/>
+      </w:pPr>
+      <w:r>
+        <w:drawing>
+          <wp:inline distT="0" distB="0" distL="0" distR="0">
+            <wp:extent cx="5715000" cy="3133725"/>
+            <wp:effectExtent t="0" r="0" b="0" l="0"/>
+            <wp:docPr id="1" name="" descr="" title=""/>
+            <wp:cNvGraphicFramePr>
+              <a:graphicFrameLocks xmlns:a="http://schemas.openxmlformats.org/drawingml/2006/main" noChangeAspect="1"/>
+            </wp:cNvGraphicFramePr>
+            <a:graphic xmlns:a="http://schemas.openxmlformats.org/drawingml/2006/main">
+              <a:graphicData uri="http://schemas.openxmlformats.org/drawingml/2006/picture">
+                <pic:pic xmlns:pic="http://schemas.openxmlformats.org/drawingml/2006/picture">
+                  <pic:nvPicPr>
+                    <pic:cNvPr id="0" name="" descr=""/>
+                    <pic:cNvPicPr>
+                      <a:picLocks noChangeAspect="1" noChangeArrowheads="1"/>
+                    </pic:cNvPicPr>
+                  </pic:nvPicPr>
+                  <pic:blipFill>
+                    <a:blip r:embed="rId24" cstate="none"/>
+                    <a:srcRect/>
+                    <a:stretch>
+                      <a:fillRect/>
+                    </a:stretch>
+                  </pic:blipFill>
+                  <pic:spPr bwMode="auto">
+                    <a:xfrm>
+                      <a:off x="0" y="0"/>
+                      <a:ext cx="5715000" cy="3133725"/>
+                    </a:xfrm>
+                    <a:prstGeom prst="rect">
+                      <a:avLst/>
+                    </a:prstGeom>
+                  </pic:spPr>
+                </pic:pic>
+              </a:graphicData>
+            </a:graphic>
+          </wp:inline>
+        </w:drawing>
+      </w:r>
+    </w:p>
+    <w:p>
+      <w:pPr>
         <w:pBdr>
-          <w:top w:val="dashed" w:color="023E71" w:sz="6"/>
-          <w:bottom w:val="dashed" w:color="023E71" w:sz="6"/>
-          <w:left w:val="dashed" w:color="023E71" w:sz="6"/>
-          <w:right w:val="dashed" w:color="023E71" w:sz="6"/>
+          <w:bottom w:val="single" w:color="EEF3F9" w:sz="2"/>
         </w:pBdr>
-        <w:shd w:fill="EEF3F9" w:val="clear"/>
-        <w:spacing w:after="180" w:before="80"/>
+        <w:spacing w:after="200"/>
         <w:jc w:val="center"/>
       </w:pPr>
       <w:r>
         <w:rPr>
           <w:i/>
           <w:iCs/>
-          <w:color w:val="023E71"/>
-          <w:sz w:val="20"/>
-          <w:szCs w:val="20"/>
+          <w:color w:val="667788"/>
+          <w:sz w:val="16"/>
+          <w:szCs w:val="16"/>
         </w:rPr>
-        <w:t xml:space="preserve">[  Screenshot: Compliance &amp; Expiry report  ]</w:t>
+        <w:t xml:space="preserve">Figure 19: The Compliance &amp; Expiry report</w:t>
       </w:r>
     </w:p>
     <w:p>
@@ -2106,25 +2844,67 @@
     </w:p>
     <w:p>
       <w:pPr>
+        <w:spacing w:after="20" w:before="100"/>
+        <w:jc w:val="center"/>
+      </w:pPr>
+      <w:r>
+        <w:drawing>
+          <wp:inline distT="0" distB="0" distL="0" distR="0">
+            <wp:extent cx="5715000" cy="3086100"/>
+            <wp:effectExtent t="0" r="0" b="0" l="0"/>
+            <wp:docPr id="1" name="" descr="" title=""/>
+            <wp:cNvGraphicFramePr>
+              <a:graphicFrameLocks xmlns:a="http://schemas.openxmlformats.org/drawingml/2006/main" noChangeAspect="1"/>
+            </wp:cNvGraphicFramePr>
+            <a:graphic xmlns:a="http://schemas.openxmlformats.org/drawingml/2006/main">
+              <a:graphicData uri="http://schemas.openxmlformats.org/drawingml/2006/picture">
+                <pic:pic xmlns:pic="http://schemas.openxmlformats.org/drawingml/2006/picture">
+                  <pic:nvPicPr>
+                    <pic:cNvPr id="0" name="" descr=""/>
+                    <pic:cNvPicPr>
+                      <a:picLocks noChangeAspect="1" noChangeArrowheads="1"/>
+                    </pic:cNvPicPr>
+                  </pic:nvPicPr>
+                  <pic:blipFill>
+                    <a:blip r:embed="rId25" cstate="none"/>
+                    <a:srcRect/>
+                    <a:stretch>
+                      <a:fillRect/>
+                    </a:stretch>
+                  </pic:blipFill>
+                  <pic:spPr bwMode="auto">
+                    <a:xfrm>
+                      <a:off x="0" y="0"/>
+                      <a:ext cx="5715000" cy="3086100"/>
+                    </a:xfrm>
+                    <a:prstGeom prst="rect">
+                      <a:avLst/>
+                    </a:prstGeom>
+                  </pic:spPr>
+                </pic:pic>
+              </a:graphicData>
+            </a:graphic>
+          </wp:inline>
+        </w:drawing>
+      </w:r>
+    </w:p>
+    <w:p>
+      <w:pPr>
         <w:pBdr>
-          <w:top w:val="dashed" w:color="023E71" w:sz="6"/>
-          <w:bottom w:val="dashed" w:color="023E71" w:sz="6"/>
-          <w:left w:val="dashed" w:color="023E71" w:sz="6"/>
-          <w:right w:val="dashed" w:color="023E71" w:sz="6"/>
+          <w:bottom w:val="single" w:color="EEF3F9" w:sz="2"/>
         </w:pBdr>
-        <w:shd w:fill="EEF3F9" w:val="clear"/>
-        <w:spacing w:after="180" w:before="80"/>
+        <w:spacing w:after="200"/>
         <w:jc w:val="center"/>
       </w:pPr>
       <w:r>
         <w:rPr>
           <w:i/>
           <w:iCs/>
-          <w:color w:val="023E71"/>
-          <w:sz w:val="20"/>
-          <w:szCs w:val="20"/>
+          <w:color w:val="667788"/>
+          <w:sz w:val="16"/>
+          <w:szCs w:val="16"/>
         </w:rPr>
-        <w:t xml:space="preserve">[  Screenshot: Job Assignments  ]</w:t>
+        <w:t xml:space="preserve">Figure 20: Job Assignments</w:t>
       </w:r>
     </w:p>
     <w:p>
@@ -2222,25 +3002,67 @@
     </w:p>
     <w:p>
       <w:pPr>
+        <w:spacing w:after="20" w:before="100"/>
+        <w:jc w:val="center"/>
+      </w:pPr>
+      <w:r>
+        <w:drawing>
+          <wp:inline distT="0" distB="0" distL="0" distR="0">
+            <wp:extent cx="5715000" cy="3095625"/>
+            <wp:effectExtent t="0" r="0" b="0" l="0"/>
+            <wp:docPr id="1" name="" descr="" title=""/>
+            <wp:cNvGraphicFramePr>
+              <a:graphicFrameLocks xmlns:a="http://schemas.openxmlformats.org/drawingml/2006/main" noChangeAspect="1"/>
+            </wp:cNvGraphicFramePr>
+            <a:graphic xmlns:a="http://schemas.openxmlformats.org/drawingml/2006/main">
+              <a:graphicData uri="http://schemas.openxmlformats.org/drawingml/2006/picture">
+                <pic:pic xmlns:pic="http://schemas.openxmlformats.org/drawingml/2006/picture">
+                  <pic:nvPicPr>
+                    <pic:cNvPr id="0" name="" descr=""/>
+                    <pic:cNvPicPr>
+                      <a:picLocks noChangeAspect="1" noChangeArrowheads="1"/>
+                    </pic:cNvPicPr>
+                  </pic:nvPicPr>
+                  <pic:blipFill>
+                    <a:blip r:embed="rId26" cstate="none"/>
+                    <a:srcRect/>
+                    <a:stretch>
+                      <a:fillRect/>
+                    </a:stretch>
+                  </pic:blipFill>
+                  <pic:spPr bwMode="auto">
+                    <a:xfrm>
+                      <a:off x="0" y="0"/>
+                      <a:ext cx="5715000" cy="3095625"/>
+                    </a:xfrm>
+                    <a:prstGeom prst="rect">
+                      <a:avLst/>
+                    </a:prstGeom>
+                  </pic:spPr>
+                </pic:pic>
+              </a:graphicData>
+            </a:graphic>
+          </wp:inline>
+        </w:drawing>
+      </w:r>
+    </w:p>
+    <w:p>
+      <w:pPr>
         <w:pBdr>
-          <w:top w:val="dashed" w:color="023E71" w:sz="6"/>
-          <w:bottom w:val="dashed" w:color="023E71" w:sz="6"/>
-          <w:left w:val="dashed" w:color="023E71" w:sz="6"/>
-          <w:right w:val="dashed" w:color="023E71" w:sz="6"/>
+          <w:bottom w:val="single" w:color="EEF3F9" w:sz="2"/>
         </w:pBdr>
-        <w:shd w:fill="EEF3F9" w:val="clear"/>
-        <w:spacing w:after="180" w:before="80"/>
+        <w:spacing w:after="200"/>
         <w:jc w:val="center"/>
       </w:pPr>
       <w:r>
         <w:rPr>
           <w:i/>
           <w:iCs/>
-          <w:color w:val="023E71"/>
-          <w:sz w:val="20"/>
-          <w:szCs w:val="20"/>
+          <w:color w:val="667788"/>
+          <w:sz w:val="16"/>
+          <w:szCs w:val="16"/>
         </w:rPr>
-        <w:t xml:space="preserve">[  Screenshot: Approvals inbox  ]</w:t>
+        <w:t xml:space="preserve">Figure 21: The Approvals inbox</w:t>
       </w:r>
     </w:p>
     <w:p>
@@ -2315,25 +3137,67 @@
     </w:p>
     <w:p>
       <w:pPr>
+        <w:spacing w:after="20" w:before="100"/>
+        <w:jc w:val="center"/>
+      </w:pPr>
+      <w:r>
+        <w:drawing>
+          <wp:inline distT="0" distB="0" distL="0" distR="0">
+            <wp:extent cx="5715000" cy="3114675"/>
+            <wp:effectExtent t="0" r="0" b="0" l="0"/>
+            <wp:docPr id="1" name="" descr="" title=""/>
+            <wp:cNvGraphicFramePr>
+              <a:graphicFrameLocks xmlns:a="http://schemas.openxmlformats.org/drawingml/2006/main" noChangeAspect="1"/>
+            </wp:cNvGraphicFramePr>
+            <a:graphic xmlns:a="http://schemas.openxmlformats.org/drawingml/2006/main">
+              <a:graphicData uri="http://schemas.openxmlformats.org/drawingml/2006/picture">
+                <pic:pic xmlns:pic="http://schemas.openxmlformats.org/drawingml/2006/picture">
+                  <pic:nvPicPr>
+                    <pic:cNvPr id="0" name="" descr=""/>
+                    <pic:cNvPicPr>
+                      <a:picLocks noChangeAspect="1" noChangeArrowheads="1"/>
+                    </pic:cNvPicPr>
+                  </pic:nvPicPr>
+                  <pic:blipFill>
+                    <a:blip r:embed="rId27" cstate="none"/>
+                    <a:srcRect/>
+                    <a:stretch>
+                      <a:fillRect/>
+                    </a:stretch>
+                  </pic:blipFill>
+                  <pic:spPr bwMode="auto">
+                    <a:xfrm>
+                      <a:off x="0" y="0"/>
+                      <a:ext cx="5715000" cy="3114675"/>
+                    </a:xfrm>
+                    <a:prstGeom prst="rect">
+                      <a:avLst/>
+                    </a:prstGeom>
+                  </pic:spPr>
+                </pic:pic>
+              </a:graphicData>
+            </a:graphic>
+          </wp:inline>
+        </w:drawing>
+      </w:r>
+    </w:p>
+    <w:p>
+      <w:pPr>
         <w:pBdr>
-          <w:top w:val="dashed" w:color="023E71" w:sz="6"/>
-          <w:bottom w:val="dashed" w:color="023E71" w:sz="6"/>
-          <w:left w:val="dashed" w:color="023E71" w:sz="6"/>
-          <w:right w:val="dashed" w:color="023E71" w:sz="6"/>
+          <w:bottom w:val="single" w:color="EEF3F9" w:sz="2"/>
         </w:pBdr>
-        <w:shd w:fill="EEF3F9" w:val="clear"/>
-        <w:spacing w:after="180" w:before="80"/>
+        <w:spacing w:after="200"/>
         <w:jc w:val="center"/>
       </w:pPr>
       <w:r>
         <w:rPr>
           <w:i/>
           <w:iCs/>
-          <w:color w:val="023E71"/>
-          <w:sz w:val="20"/>
-          <w:szCs w:val="20"/>
+          <w:color w:val="667788"/>
+          <w:sz w:val="16"/>
+          <w:szCs w:val="16"/>
         </w:rPr>
-        <w:t xml:space="preserve">[  Screenshot: Users &amp; Roles with the security controls  ]</w:t>
+        <w:t xml:space="preserve">Figure 22: Users &amp; Roles with the security controls</w:t>
       </w:r>
     </w:p>
     <w:p>
@@ -2417,25 +3281,67 @@
     </w:p>
     <w:p>
       <w:pPr>
+        <w:spacing w:after="20" w:before="100"/>
+        <w:jc w:val="center"/>
+      </w:pPr>
+      <w:r>
+        <w:drawing>
+          <wp:inline distT="0" distB="0" distL="0" distR="0">
+            <wp:extent cx="5715000" cy="3057525"/>
+            <wp:effectExtent t="0" r="0" b="0" l="0"/>
+            <wp:docPr id="1" name="" descr="" title=""/>
+            <wp:cNvGraphicFramePr>
+              <a:graphicFrameLocks xmlns:a="http://schemas.openxmlformats.org/drawingml/2006/main" noChangeAspect="1"/>
+            </wp:cNvGraphicFramePr>
+            <a:graphic xmlns:a="http://schemas.openxmlformats.org/drawingml/2006/main">
+              <a:graphicData uri="http://schemas.openxmlformats.org/drawingml/2006/picture">
+                <pic:pic xmlns:pic="http://schemas.openxmlformats.org/drawingml/2006/picture">
+                  <pic:nvPicPr>
+                    <pic:cNvPr id="0" name="" descr=""/>
+                    <pic:cNvPicPr>
+                      <a:picLocks noChangeAspect="1" noChangeArrowheads="1"/>
+                    </pic:cNvPicPr>
+                  </pic:nvPicPr>
+                  <pic:blipFill>
+                    <a:blip r:embed="rId28" cstate="none"/>
+                    <a:srcRect/>
+                    <a:stretch>
+                      <a:fillRect/>
+                    </a:stretch>
+                  </pic:blipFill>
+                  <pic:spPr bwMode="auto">
+                    <a:xfrm>
+                      <a:off x="0" y="0"/>
+                      <a:ext cx="5715000" cy="3057525"/>
+                    </a:xfrm>
+                    <a:prstGeom prst="rect">
+                      <a:avLst/>
+                    </a:prstGeom>
+                  </pic:spPr>
+                </pic:pic>
+              </a:graphicData>
+            </a:graphic>
+          </wp:inline>
+        </w:drawing>
+      </w:r>
+    </w:p>
+    <w:p>
+      <w:pPr>
         <w:pBdr>
-          <w:top w:val="dashed" w:color="023E71" w:sz="6"/>
-          <w:bottom w:val="dashed" w:color="023E71" w:sz="6"/>
-          <w:left w:val="dashed" w:color="023E71" w:sz="6"/>
-          <w:right w:val="dashed" w:color="023E71" w:sz="6"/>
+          <w:bottom w:val="single" w:color="EEF3F9" w:sz="2"/>
         </w:pBdr>
-        <w:shd w:fill="EEF3F9" w:val="clear"/>
-        <w:spacing w:after="180" w:before="80"/>
+        <w:spacing w:after="200"/>
         <w:jc w:val="center"/>
       </w:pPr>
       <w:r>
         <w:rPr>
           <w:i/>
           <w:iCs/>
-          <w:color w:val="023E71"/>
-          <w:sz w:val="20"/>
-          <w:szCs w:val="20"/>
+          <w:color w:val="667788"/>
+          <w:sz w:val="16"/>
+          <w:szCs w:val="16"/>
         </w:rPr>
-        <w:t xml:space="preserve">[  Screenshot: Access Control — a module expanded into screens  ]</w:t>
+        <w:t xml:space="preserve">Figure 23: Access Control — a module expanded into screens</w:t>
       </w:r>
     </w:p>
     <w:p>
@@ -2522,25 +3428,67 @@
     </w:p>
     <w:p>
       <w:pPr>
+        <w:spacing w:after="20" w:before="100"/>
+        <w:jc w:val="center"/>
+      </w:pPr>
+      <w:r>
+        <w:drawing>
+          <wp:inline distT="0" distB="0" distL="0" distR="0">
+            <wp:extent cx="5715000" cy="3057525"/>
+            <wp:effectExtent t="0" r="0" b="0" l="0"/>
+            <wp:docPr id="1" name="" descr="" title=""/>
+            <wp:cNvGraphicFramePr>
+              <a:graphicFrameLocks xmlns:a="http://schemas.openxmlformats.org/drawingml/2006/main" noChangeAspect="1"/>
+            </wp:cNvGraphicFramePr>
+            <a:graphic xmlns:a="http://schemas.openxmlformats.org/drawingml/2006/main">
+              <a:graphicData uri="http://schemas.openxmlformats.org/drawingml/2006/picture">
+                <pic:pic xmlns:pic="http://schemas.openxmlformats.org/drawingml/2006/picture">
+                  <pic:nvPicPr>
+                    <pic:cNvPr id="0" name="" descr=""/>
+                    <pic:cNvPicPr>
+                      <a:picLocks noChangeAspect="1" noChangeArrowheads="1"/>
+                    </pic:cNvPicPr>
+                  </pic:nvPicPr>
+                  <pic:blipFill>
+                    <a:blip r:embed="rId29" cstate="none"/>
+                    <a:srcRect/>
+                    <a:stretch>
+                      <a:fillRect/>
+                    </a:stretch>
+                  </pic:blipFill>
+                  <pic:spPr bwMode="auto">
+                    <a:xfrm>
+                      <a:off x="0" y="0"/>
+                      <a:ext cx="5715000" cy="3057525"/>
+                    </a:xfrm>
+                    <a:prstGeom prst="rect">
+                      <a:avLst/>
+                    </a:prstGeom>
+                  </pic:spPr>
+                </pic:pic>
+              </a:graphicData>
+            </a:graphic>
+          </wp:inline>
+        </w:drawing>
+      </w:r>
+    </w:p>
+    <w:p>
+      <w:pPr>
         <w:pBdr>
-          <w:top w:val="dashed" w:color="023E71" w:sz="6"/>
-          <w:bottom w:val="dashed" w:color="023E71" w:sz="6"/>
-          <w:left w:val="dashed" w:color="023E71" w:sz="6"/>
-          <w:right w:val="dashed" w:color="023E71" w:sz="6"/>
+          <w:bottom w:val="single" w:color="EEF3F9" w:sz="2"/>
         </w:pBdr>
-        <w:shd w:fill="EEF3F9" w:val="clear"/>
-        <w:spacing w:after="180" w:before="80"/>
+        <w:spacing w:after="200"/>
         <w:jc w:val="center"/>
       </w:pPr>
       <w:r>
         <w:rPr>
           <w:i/>
           <w:iCs/>
-          <w:color w:val="023E71"/>
-          <w:sz w:val="20"/>
-          <w:szCs w:val="20"/>
+          <w:color w:val="667788"/>
+          <w:sz w:val="16"/>
+          <w:szCs w:val="16"/>
         </w:rPr>
-        <w:t xml:space="preserve">[  Screenshot: Notifications &amp; alerts  ]</w:t>
+        <w:t xml:space="preserve">Figure 24: Notifications &amp; alerts</w:t>
       </w:r>
     </w:p>
     <w:p>
@@ -2562,25 +3510,67 @@
     </w:p>
     <w:p>
       <w:pPr>
+        <w:spacing w:after="20" w:before="100"/>
+        <w:jc w:val="center"/>
+      </w:pPr>
+      <w:r>
+        <w:drawing>
+          <wp:inline distT="0" distB="0" distL="0" distR="0">
+            <wp:extent cx="5715000" cy="3209925"/>
+            <wp:effectExtent t="0" r="0" b="0" l="0"/>
+            <wp:docPr id="1" name="" descr="" title=""/>
+            <wp:cNvGraphicFramePr>
+              <a:graphicFrameLocks xmlns:a="http://schemas.openxmlformats.org/drawingml/2006/main" noChangeAspect="1"/>
+            </wp:cNvGraphicFramePr>
+            <a:graphic xmlns:a="http://schemas.openxmlformats.org/drawingml/2006/main">
+              <a:graphicData uri="http://schemas.openxmlformats.org/drawingml/2006/picture">
+                <pic:pic xmlns:pic="http://schemas.openxmlformats.org/drawingml/2006/picture">
+                  <pic:nvPicPr>
+                    <pic:cNvPr id="0" name="" descr=""/>
+                    <pic:cNvPicPr>
+                      <a:picLocks noChangeAspect="1" noChangeArrowheads="1"/>
+                    </pic:cNvPicPr>
+                  </pic:nvPicPr>
+                  <pic:blipFill>
+                    <a:blip r:embed="rId30" cstate="none"/>
+                    <a:srcRect/>
+                    <a:stretch>
+                      <a:fillRect/>
+                    </a:stretch>
+                  </pic:blipFill>
+                  <pic:spPr bwMode="auto">
+                    <a:xfrm>
+                      <a:off x="0" y="0"/>
+                      <a:ext cx="5715000" cy="3209925"/>
+                    </a:xfrm>
+                    <a:prstGeom prst="rect">
+                      <a:avLst/>
+                    </a:prstGeom>
+                  </pic:spPr>
+                </pic:pic>
+              </a:graphicData>
+            </a:graphic>
+          </wp:inline>
+        </w:drawing>
+      </w:r>
+    </w:p>
+    <w:p>
+      <w:pPr>
         <w:pBdr>
-          <w:top w:val="dashed" w:color="023E71" w:sz="6"/>
-          <w:bottom w:val="dashed" w:color="023E71" w:sz="6"/>
-          <w:left w:val="dashed" w:color="023E71" w:sz="6"/>
-          <w:right w:val="dashed" w:color="023E71" w:sz="6"/>
+          <w:bottom w:val="single" w:color="EEF3F9" w:sz="2"/>
         </w:pBdr>
-        <w:shd w:fill="EEF3F9" w:val="clear"/>
-        <w:spacing w:after="180" w:before="80"/>
+        <w:spacing w:after="200"/>
         <w:jc w:val="center"/>
       </w:pPr>
       <w:r>
         <w:rPr>
           <w:i/>
           <w:iCs/>
-          <w:color w:val="023E71"/>
-          <w:sz w:val="20"/>
-          <w:szCs w:val="20"/>
+          <w:color w:val="667788"/>
+          <w:sz w:val="16"/>
+          <w:szCs w:val="16"/>
         </w:rPr>
-        <w:t xml:space="preserve">[  Screenshot: Help Center  ]</w:t>
+        <w:t xml:space="preserve">Figure 25: The Help Center</w:t>
       </w:r>
     </w:p>
     <w:p>

</xml_diff>